<commit_message>
Refocus on coal: Mind ID flagship is coal (PTBA-style); replace nickel/bauxite with coal subsidiaries, DME gasification, HBA royalty, Tanjung Enim/Sumsel
</commit_message>
<xml_diff>
--- a/samples/01_Contoso_Minerals_Mining_Regulation_Brief.docx
+++ b/samples/01_Contoso_Minerals_Mining_Regulation_Brief.docx
@@ -43,7 +43,7 @@
           <w:b w:val="0"/>
           <w:sz w:val="22"/>
         </w:rPr>
-        <w:t>Pemerintah menerbitkan Peraturan Menteri ESDM No. 7 Tahun 2026 tentang Perubahan Kedua atas Permen ESDM No. 11 Tahun 2018 tentang Tata Cara Pemberian Wilayah, Perizinan, dan Pelaporan pada Kegiatan Usaha Pertambangan Mineral dan Batubara. Permen baru ini memperketat kewajiban hilirisasi (smelter) bagi pemegang IUP-OP dan IUPK-OP komoditas nikel, bauksit, tembaga, dan timah, dengan tenggat percepatan dari Desember 2027 menjadi Juni 2027.</w:t>
+        <w:t>Pemerintah menerbitkan Peraturan Menteri ESDM No. 7 Tahun 2026 tentang Perubahan Kedua atas Permen ESDM No. 11 Tahun 2018 tentang Tata Cara Pemberian Wilayah, Perizinan, dan Pelaporan pada Kegiatan Usaha Pertambangan Mineral dan Batubara. Permen baru ini memperketat kewajiban hilirisasi (fasilitas gasifikasi batubara) bagi pemegang IUP-OP dan IUPK-OP komoditas batubara, tembaga, dan timah, dengan tenggat percepatan dari Desember 2027 menjadi Juni 2027.</w:t>
       </w:r>
     </w:p>
     <w:p>
@@ -115,7 +115,7 @@
         <w:pStyle w:val="ListBullet"/>
       </w:pPr>
       <w:r>
-        <w:t>Pasal 17A — Pemegang IUP-OP wajib menyelesaikan pembangunan fasilitas pemurnian (smelter) paling lambat 30 Juni 2027 (sebelumnya 31 Desember 2027).</w:t>
+        <w:t>Pasal 17A — Pemegang IUP-OP wajib menyelesaikan pembangunan fasilitas hilirisasi/gasifikasi batubara paling lambat 30 Juni 2027 (sebelumnya 31 Desember 2027).</w:t>
       </w:r>
     </w:p>
     <w:p>
@@ -139,7 +139,7 @@
         <w:pStyle w:val="ListBullet"/>
       </w:pPr>
       <w:r>
-        <w:t>Pasal 27A (baru) — Kewajiban Rencana Pasca Tambang (RPT) wajib disetujui sebelum perpanjangan IUP-OP, dengan jaminan reklamasi minimal Rp 50 miliar untuk komoditas nikel.</w:t>
+        <w:t>Pasal 27A (baru) — Kewajiban Rencana Pasca Tambang (RPT) wajib disetujui sebelum perpanjangan IUP-OP, dengan jaminan reklamasi minimal Rp 50 miliar untuk komoditas batubara.</w:t>
       </w:r>
     </w:p>
     <w:p>
@@ -147,7 +147,7 @@
         <w:pStyle w:val="ListBullet"/>
       </w:pPr>
       <w:r>
-        <w:t>Pasal 31 — Perubahan formula royalti untuk bijih nikel ekspor (jika smelter belum operasional): naik dari 10% menjadi 14% dari harga patokan mineral.</w:t>
+        <w:t>Pasal 31 — Perubahan formula royalti untuk batubara ekspor (jika fasilitas gasifikasi batubara belum operasional): naik dari 10% menjadi 14% dari Harga Batubara Acuan (HBA).</w:t>
       </w:r>
     </w:p>
     <w:p>
@@ -163,7 +163,7 @@
         <w:pStyle w:val="ListBullet"/>
       </w:pPr>
       <w:r>
-        <w:t>PT Contoso Nickel Sulawesi (AH) — Smelter di Morowali masih 78% progress. Risiko gagal tenggat Juni 2027: paparan royalti tambahan ±USD 18 juta/tahun.</w:t>
+        <w:t>PT Contoso Coal Sumsel (AH) — Fasilitas Gasifikasi Batubara di Tanjung Enim, Sumsel masih 78% progress. Risiko gagal tenggat Juni 2027: paparan royalti tambahan ±USD 18 juta/tahun.</w:t>
       </w:r>
     </w:p>
     <w:p>
@@ -171,7 +171,7 @@
         <w:pStyle w:val="ListBullet"/>
       </w:pPr>
       <w:r>
-        <w:t>PT Contoso Bauxite Kalimantan (AH) — Belum memiliki komitmen smelter; perlu evaluasi opsi tolling agreement dengan pihak ketiga.</w:t>
+        <w:t>PT Contoso Coal Kaltim (AH) — Belum memiliki komitmen fasilitas gasifikasi batubara; perlu evaluasi opsi tolling agreement dengan pihak ketiga.</w:t>
       </w:r>
     </w:p>
     <w:p>

</xml_diff>